<commit_message>
Update Muressons Simulation components, docs, and configurations
</commit_message>
<xml_diff>
--- a/Muressons_Student_Manual_v2.docx
+++ b/Muressons_Student_Manual_v2.docx
@@ -19219,6 +19219,859 @@
         <w:t>Muressons Global Corporation © 2026</w:t>
       </w:r>
     </w:p>
+    <w:p>
+      <w:r>
+        <w:br w:type="page"/>
+      </w:r>
+    </w:p>
+    <w:p>
+      <w:pPr>
+        <w:pStyle w:val="Heading1"/>
+      </w:pPr>
+      <w:r>
+        <w:rPr>
+          <w:color w:val="1A1A2E"/>
+        </w:rPr>
+        <w:t>Appendix: Carbon-Adjusted Return on Invested Capital (CAROIC)</w:t>
+      </w:r>
+    </w:p>
+    <w:p>
+      <w:pPr>
+        <w:pStyle w:val="Heading2"/>
+      </w:pPr>
+      <w:r>
+        <w:rPr>
+          <w:color w:val="1A1A2E"/>
+        </w:rPr>
+        <w:t>What is CAROIC?</w:t>
+      </w:r>
+    </w:p>
+    <w:p>
+      <w:r>
+        <w:rPr>
+          <w:b w:val="0"/>
+          <w:i w:val="0"/>
+          <w:sz w:val="22"/>
+        </w:rPr>
+        <w:t>CAROIC is a new financial metric that measures how efficiently your company generates returns relative to both its financial capital AND its carbon footprint. Think of it as a "carbon-adjusted profit efficiency" score. A company that earns high returns but pollutes heavily will see its CAROIC compressed — revealing the hidden cost of carbon dependence before regulators come knocking.</w:t>
+      </w:r>
+    </w:p>
+    <w:p>
+      <w:pPr>
+        <w:pStyle w:val="Heading2"/>
+      </w:pPr>
+      <w:r>
+        <w:rPr>
+          <w:color w:val="1A1A2E"/>
+        </w:rPr>
+        <w:t>The Formula</w:t>
+      </w:r>
+    </w:p>
+    <w:p>
+      <w:r>
+        <w:rPr>
+          <w:b/>
+          <w:sz w:val="22"/>
+        </w:rPr>
+        <w:t xml:space="preserve">Formula: </w:t>
+      </w:r>
+      <w:r>
+        <w:rPr>
+          <w:rFonts w:ascii="Consolas" w:hAnsi="Consolas"/>
+          <w:sz w:val="20"/>
+        </w:rPr>
+        <w:t>CAROIC = EBITDA × (1 − Tax Rate) / (Invested Capital + Carbon Tonnage × Shadow Carbon Price)</w:t>
+      </w:r>
+    </w:p>
+    <w:p>
+      <w:r>
+        <w:rPr>
+          <w:b/>
+          <w:i w:val="0"/>
+          <w:sz w:val="22"/>
+        </w:rPr>
+        <w:t>Component Definitions:</w:t>
+      </w:r>
+    </w:p>
+    <w:p>
+      <w:pPr>
+        <w:pStyle w:val="ListBullet"/>
+      </w:pPr>
+      <w:r>
+        <w:rPr>
+          <w:b/>
+          <w:sz w:val="22"/>
+        </w:rPr>
+        <w:t xml:space="preserve">EBITDA: </w:t>
+      </w:r>
+      <w:r>
+        <w:rPr>
+          <w:sz w:val="22"/>
+        </w:rPr>
+        <w:t>Group-level Earnings Before Interest, Tax, Depreciation &amp; Amortisation = Σ(Revenue_i − OPEX_i)</w:t>
+      </w:r>
+    </w:p>
+    <w:p>
+      <w:pPr>
+        <w:pStyle w:val="ListBullet"/>
+      </w:pPr>
+      <w:r>
+        <w:rPr>
+          <w:b/>
+          <w:sz w:val="22"/>
+        </w:rPr>
+        <w:t xml:space="preserve">Tax Rate: </w:t>
+      </w:r>
+      <w:r>
+        <w:rPr>
+          <w:sz w:val="22"/>
+        </w:rPr>
+        <w:t>Effective corporate tax rate (default 25%, clamped to 0–100%)</w:t>
+      </w:r>
+    </w:p>
+    <w:p>
+      <w:pPr>
+        <w:pStyle w:val="ListBullet"/>
+      </w:pPr>
+      <w:r>
+        <w:rPr>
+          <w:b/>
+          <w:sz w:val="22"/>
+        </w:rPr>
+        <w:t xml:space="preserve">NOPAT: </w:t>
+      </w:r>
+      <w:r>
+        <w:rPr>
+          <w:sz w:val="22"/>
+        </w:rPr>
+        <w:t>Net Operating Profit After Tax = EBITDA × (1 − Tax Rate)</w:t>
+      </w:r>
+    </w:p>
+    <w:p>
+      <w:pPr>
+        <w:pStyle w:val="ListBullet"/>
+      </w:pPr>
+      <w:r>
+        <w:rPr>
+          <w:b/>
+          <w:sz w:val="22"/>
+        </w:rPr>
+        <w:t xml:space="preserve">Invested Capital: </w:t>
+      </w:r>
+      <w:r>
+        <w:rPr>
+          <w:sz w:val="22"/>
+        </w:rPr>
+        <w:t>Corporate Treasury (proxy for total capital deployed). Floored at $0 for insolvent firms</w:t>
+      </w:r>
+    </w:p>
+    <w:p>
+      <w:pPr>
+        <w:pStyle w:val="ListBullet"/>
+      </w:pPr>
+      <w:r>
+        <w:rPr>
+          <w:b/>
+          <w:sz w:val="22"/>
+        </w:rPr>
+        <w:t xml:space="preserve">Carbon Tonnage: </w:t>
+      </w:r>
+      <w:r>
+        <w:rPr>
+          <w:sz w:val="22"/>
+        </w:rPr>
+        <w:t>Σ(BU Carbon Intensity × BU Revenue / 1,000,000) — same formula used in R10 terminal valuation</w:t>
+      </w:r>
+    </w:p>
+    <w:p>
+      <w:pPr>
+        <w:pStyle w:val="ListBullet"/>
+      </w:pPr>
+      <w:r>
+        <w:rPr>
+          <w:b/>
+          <w:sz w:val="22"/>
+        </w:rPr>
+        <w:t xml:space="preserve">Shadow Carbon Price: </w:t>
+      </w:r>
+      <w:r>
+        <w:rPr>
+          <w:sz w:val="22"/>
+        </w:rPr>
+        <w:t>Internal carbon price per ton (default $250, aligned with R10 carbon tax)</w:t>
+      </w:r>
+    </w:p>
+    <w:p>
+      <w:pPr>
+        <w:pStyle w:val="ListBullet"/>
+      </w:pPr>
+      <w:r>
+        <w:rPr>
+          <w:b/>
+          <w:sz w:val="22"/>
+        </w:rPr>
+        <w:t xml:space="preserve">Carbon Capital Charge: </w:t>
+      </w:r>
+      <w:r>
+        <w:rPr>
+          <w:sz w:val="22"/>
+        </w:rPr>
+        <w:t>Carbon Tonnage × Shadow Carbon Price — the "carbon penalty" inflating the denominator</w:t>
+      </w:r>
+    </w:p>
+    <w:p>
+      <w:pPr>
+        <w:pStyle w:val="ListBullet"/>
+      </w:pPr>
+      <w:r>
+        <w:rPr>
+          <w:b/>
+          <w:sz w:val="22"/>
+        </w:rPr>
+        <w:t xml:space="preserve">Adjusted Capital: </w:t>
+      </w:r>
+      <w:r>
+        <w:rPr>
+          <w:sz w:val="22"/>
+        </w:rPr>
+        <w:t>Invested Capital + Carbon Capital Charge — the effective capital base</w:t>
+      </w:r>
+    </w:p>
+    <w:p>
+      <w:pPr>
+        <w:pStyle w:val="Heading2"/>
+      </w:pPr>
+      <w:r>
+        <w:rPr>
+          <w:color w:val="1A1A2E"/>
+        </w:rPr>
+        <w:t>CAROIC Grading Scale</w:t>
+      </w:r>
+    </w:p>
+    <w:p>
+      <w:r>
+        <w:rPr>
+          <w:b w:val="0"/>
+          <w:i w:val="0"/>
+          <w:sz w:val="22"/>
+        </w:rPr>
+        <w:t>Your CAROIC is graded every round. Here is what each grade means:</w:t>
+      </w:r>
+    </w:p>
+    <w:tbl>
+      <w:tblPr>
+        <w:tblStyle w:val="LightGrid-Accent1"/>
+        <w:tblW w:type="auto" w:w="0"/>
+        <w:tblLook w:firstColumn="1" w:firstRow="1" w:lastColumn="0" w:lastRow="0" w:noHBand="0" w:noVBand="1" w:val="04A0"/>
+      </w:tblPr>
+      <w:tblGrid>
+        <w:gridCol w:w="3024"/>
+        <w:gridCol w:w="3024"/>
+        <w:gridCol w:w="3024"/>
+      </w:tblGrid>
+      <w:tr>
+        <w:tc>
+          <w:tcPr>
+            <w:tcW w:type="dxa" w:w="3024"/>
+          </w:tcPr>
+          <w:p>
+            <w:r>
+              <w:rPr>
+                <w:b/>
+                <w:sz w:val="20"/>
+              </w:rPr>
+              <w:t>Grade</w:t>
+            </w:r>
+          </w:p>
+        </w:tc>
+        <w:tc>
+          <w:tcPr>
+            <w:tcW w:type="dxa" w:w="3024"/>
+          </w:tcPr>
+          <w:p>
+            <w:r>
+              <w:rPr>
+                <w:b/>
+                <w:sz w:val="20"/>
+              </w:rPr>
+              <w:t>CAROIC %</w:t>
+            </w:r>
+          </w:p>
+        </w:tc>
+        <w:tc>
+          <w:tcPr>
+            <w:tcW w:type="dxa" w:w="3024"/>
+          </w:tcPr>
+          <w:p>
+            <w:r>
+              <w:rPr>
+                <w:b/>
+                <w:sz w:val="20"/>
+              </w:rPr>
+              <w:t>Interpretation</w:t>
+            </w:r>
+          </w:p>
+        </w:tc>
+      </w:tr>
+      <w:tr>
+        <w:tc>
+          <w:tcPr>
+            <w:tcW w:type="dxa" w:w="3024"/>
+          </w:tcPr>
+          <w:p>
+            <w:r>
+              <w:rPr>
+                <w:sz w:val="20"/>
+              </w:rPr>
+              <w:t>A+</w:t>
+            </w:r>
+          </w:p>
+        </w:tc>
+        <w:tc>
+          <w:tcPr>
+            <w:tcW w:type="dxa" w:w="3024"/>
+          </w:tcPr>
+          <w:p>
+            <w:r>
+              <w:rPr>
+                <w:sz w:val="20"/>
+              </w:rPr>
+              <w:t>≥ 25%</w:t>
+            </w:r>
+          </w:p>
+        </w:tc>
+        <w:tc>
+          <w:tcPr>
+            <w:tcW w:type="dxa" w:w="3024"/>
+          </w:tcPr>
+          <w:p>
+            <w:r>
+              <w:rPr>
+                <w:sz w:val="20"/>
+              </w:rPr>
+              <w:t>Exceptional capital-carbon efficiency. Minimal carbon drag on returns.</w:t>
+            </w:r>
+          </w:p>
+        </w:tc>
+      </w:tr>
+      <w:tr>
+        <w:tc>
+          <w:tcPr>
+            <w:tcW w:type="dxa" w:w="3024"/>
+          </w:tcPr>
+          <w:p>
+            <w:r>
+              <w:rPr>
+                <w:sz w:val="20"/>
+              </w:rPr>
+              <w:t>A</w:t>
+            </w:r>
+          </w:p>
+        </w:tc>
+        <w:tc>
+          <w:tcPr>
+            <w:tcW w:type="dxa" w:w="3024"/>
+          </w:tcPr>
+          <w:p>
+            <w:r>
+              <w:rPr>
+                <w:sz w:val="20"/>
+              </w:rPr>
+              <w:t>≥ 15%</w:t>
+            </w:r>
+          </w:p>
+        </w:tc>
+        <w:tc>
+          <w:tcPr>
+            <w:tcW w:type="dxa" w:w="3024"/>
+          </w:tcPr>
+          <w:p>
+            <w:r>
+              <w:rPr>
+                <w:sz w:val="20"/>
+              </w:rPr>
+              <w:t>Strong carbon-adjusted returns. Carbon transition well-managed.</w:t>
+            </w:r>
+          </w:p>
+        </w:tc>
+      </w:tr>
+      <w:tr>
+        <w:tc>
+          <w:tcPr>
+            <w:tcW w:type="dxa" w:w="3024"/>
+          </w:tcPr>
+          <w:p>
+            <w:r>
+              <w:rPr>
+                <w:sz w:val="20"/>
+              </w:rPr>
+              <w:t>B</w:t>
+            </w:r>
+          </w:p>
+        </w:tc>
+        <w:tc>
+          <w:tcPr>
+            <w:tcW w:type="dxa" w:w="3024"/>
+          </w:tcPr>
+          <w:p>
+            <w:r>
+              <w:rPr>
+                <w:sz w:val="20"/>
+              </w:rPr>
+              <w:t>≥ 10%</w:t>
+            </w:r>
+          </w:p>
+        </w:tc>
+        <w:tc>
+          <w:tcPr>
+            <w:tcW w:type="dxa" w:w="3024"/>
+          </w:tcPr>
+          <w:p>
+            <w:r>
+              <w:rPr>
+                <w:sz w:val="20"/>
+              </w:rPr>
+              <w:t>Solid returns despite carbon drag. Room for decarbonisation gains.</w:t>
+            </w:r>
+          </w:p>
+        </w:tc>
+      </w:tr>
+      <w:tr>
+        <w:tc>
+          <w:tcPr>
+            <w:tcW w:type="dxa" w:w="3024"/>
+          </w:tcPr>
+          <w:p>
+            <w:r>
+              <w:rPr>
+                <w:sz w:val="20"/>
+              </w:rPr>
+              <w:t>C</w:t>
+            </w:r>
+          </w:p>
+        </w:tc>
+        <w:tc>
+          <w:tcPr>
+            <w:tcW w:type="dxa" w:w="3024"/>
+          </w:tcPr>
+          <w:p>
+            <w:r>
+              <w:rPr>
+                <w:sz w:val="20"/>
+              </w:rPr>
+              <w:t>≥ 5%</w:t>
+            </w:r>
+          </w:p>
+        </w:tc>
+        <w:tc>
+          <w:tcPr>
+            <w:tcW w:type="dxa" w:w="3024"/>
+          </w:tcPr>
+          <w:p>
+            <w:r>
+              <w:rPr>
+                <w:sz w:val="20"/>
+              </w:rPr>
+              <w:t>Moderate returns eroded by carbon intensity. Transition urgency rising.</w:t>
+            </w:r>
+          </w:p>
+        </w:tc>
+      </w:tr>
+      <w:tr>
+        <w:tc>
+          <w:tcPr>
+            <w:tcW w:type="dxa" w:w="3024"/>
+          </w:tcPr>
+          <w:p>
+            <w:r>
+              <w:rPr>
+                <w:sz w:val="20"/>
+              </w:rPr>
+              <w:t>D</w:t>
+            </w:r>
+          </w:p>
+        </w:tc>
+        <w:tc>
+          <w:tcPr>
+            <w:tcW w:type="dxa" w:w="3024"/>
+          </w:tcPr>
+          <w:p>
+            <w:r>
+              <w:rPr>
+                <w:sz w:val="20"/>
+              </w:rPr>
+              <w:t>≥ 0%</w:t>
+            </w:r>
+          </w:p>
+        </w:tc>
+        <w:tc>
+          <w:tcPr>
+            <w:tcW w:type="dxa" w:w="3024"/>
+          </w:tcPr>
+          <w:p>
+            <w:r>
+              <w:rPr>
+                <w:sz w:val="20"/>
+              </w:rPr>
+              <w:t>Carbon burden severely depresses returns. Stranded asset risk.</w:t>
+            </w:r>
+          </w:p>
+        </w:tc>
+      </w:tr>
+      <w:tr>
+        <w:tc>
+          <w:tcPr>
+            <w:tcW w:type="dxa" w:w="3024"/>
+          </w:tcPr>
+          <w:p>
+            <w:r>
+              <w:rPr>
+                <w:sz w:val="20"/>
+              </w:rPr>
+              <w:t>F</w:t>
+            </w:r>
+          </w:p>
+        </w:tc>
+        <w:tc>
+          <w:tcPr>
+            <w:tcW w:type="dxa" w:w="3024"/>
+          </w:tcPr>
+          <w:p>
+            <w:r>
+              <w:rPr>
+                <w:sz w:val="20"/>
+              </w:rPr>
+              <w:t>&lt; 0%</w:t>
+            </w:r>
+          </w:p>
+        </w:tc>
+        <w:tc>
+          <w:tcPr>
+            <w:tcW w:type="dxa" w:w="3024"/>
+          </w:tcPr>
+          <w:p>
+            <w:r>
+              <w:rPr>
+                <w:sz w:val="20"/>
+              </w:rPr>
+              <w:t>Negative CAROIC: operating losses compounded by carbon liability.</w:t>
+            </w:r>
+          </w:p>
+        </w:tc>
+      </w:tr>
+    </w:tbl>
+    <w:p/>
+    <w:p>
+      <w:pPr>
+        <w:pStyle w:val="Heading2"/>
+      </w:pPr>
+      <w:r>
+        <w:rPr>
+          <w:color w:val="1A1A2E"/>
+        </w:rPr>
+        <w:t>Worked Examples</w:t>
+      </w:r>
+    </w:p>
+    <w:p>
+      <w:r>
+        <w:rPr>
+          <w:b/>
+          <w:i w:val="0"/>
+          <w:sz w:val="22"/>
+        </w:rPr>
+        <w:t>Example 1 — Strong Performer:</w:t>
+      </w:r>
+    </w:p>
+    <w:p>
+      <w:pPr>
+        <w:pStyle w:val="ListBullet"/>
+      </w:pPr>
+      <w:r>
+        <w:rPr>
+          <w:sz w:val="22"/>
+        </w:rPr>
+        <w:t>Given: EBITDA = $33M, Treasury = $50M, Carbon Tonnage = 2,850t, Shadow Price = $250/t</w:t>
+      </w:r>
+    </w:p>
+    <w:p>
+      <w:pPr>
+        <w:pStyle w:val="ListBullet"/>
+      </w:pPr>
+      <w:r>
+        <w:rPr>
+          <w:sz w:val="22"/>
+        </w:rPr>
+        <w:t>NOPAT = $33M × (1 − 0.25) = $24.75M</w:t>
+      </w:r>
+    </w:p>
+    <w:p>
+      <w:pPr>
+        <w:pStyle w:val="ListBullet"/>
+      </w:pPr>
+      <w:r>
+        <w:rPr>
+          <w:sz w:val="22"/>
+        </w:rPr>
+        <w:t>Carbon Capital Charge = 2,850 × $250 = $712,500</w:t>
+      </w:r>
+    </w:p>
+    <w:p>
+      <w:pPr>
+        <w:pStyle w:val="ListBullet"/>
+      </w:pPr>
+      <w:r>
+        <w:rPr>
+          <w:sz w:val="22"/>
+        </w:rPr>
+        <w:t>Adjusted Capital = $50M + $0.7125M = $50.7125M</w:t>
+      </w:r>
+    </w:p>
+    <w:p>
+      <w:pPr>
+        <w:pStyle w:val="ListBullet"/>
+      </w:pPr>
+      <w:r>
+        <w:rPr>
+          <w:sz w:val="22"/>
+        </w:rPr>
+        <w:t>CAROIC = $24.75M / $50.7125M = 48.81% → Grade A+</w:t>
+      </w:r>
+    </w:p>
+    <w:p>
+      <w:r>
+        <w:rPr>
+          <w:b/>
+          <w:i w:val="0"/>
+          <w:sz w:val="22"/>
+        </w:rPr>
+        <w:t>Example 2 — Carbon-Heavy Company (same EBITDA, higher emissions):</w:t>
+      </w:r>
+    </w:p>
+    <w:p>
+      <w:pPr>
+        <w:pStyle w:val="ListBullet"/>
+      </w:pPr>
+      <w:r>
+        <w:rPr>
+          <w:sz w:val="22"/>
+        </w:rPr>
+        <w:t>Given: EBITDA = $33M, Treasury = $50M, Carbon Tonnage = 12,000t, Shadow Price = $250/t</w:t>
+      </w:r>
+    </w:p>
+    <w:p>
+      <w:pPr>
+        <w:pStyle w:val="ListBullet"/>
+      </w:pPr>
+      <w:r>
+        <w:rPr>
+          <w:sz w:val="22"/>
+        </w:rPr>
+        <w:t>NOPAT = $24.75M (unchanged)</w:t>
+      </w:r>
+    </w:p>
+    <w:p>
+      <w:pPr>
+        <w:pStyle w:val="ListBullet"/>
+      </w:pPr>
+      <w:r>
+        <w:rPr>
+          <w:sz w:val="22"/>
+        </w:rPr>
+        <w:t>Carbon Capital Charge = 12,000 × $250 = $3,000,000</w:t>
+      </w:r>
+    </w:p>
+    <w:p>
+      <w:pPr>
+        <w:pStyle w:val="ListBullet"/>
+      </w:pPr>
+      <w:r>
+        <w:rPr>
+          <w:sz w:val="22"/>
+        </w:rPr>
+        <w:t>Adjusted Capital = $50M + $3M = $53M</w:t>
+      </w:r>
+    </w:p>
+    <w:p>
+      <w:pPr>
+        <w:pStyle w:val="ListBullet"/>
+      </w:pPr>
+      <w:r>
+        <w:rPr>
+          <w:sz w:val="22"/>
+        </w:rPr>
+        <w:t>CAROIC = $24.75M / $53M = 46.70% → Grade A+</w:t>
+      </w:r>
+    </w:p>
+    <w:p>
+      <w:pPr>
+        <w:pStyle w:val="ListBullet"/>
+      </w:pPr>
+      <w:r>
+        <w:rPr>
+          <w:sz w:val="22"/>
+        </w:rPr>
+        <w:t>Note: Despite identical EBITDA, higher carbon tonnage compresses CAROIC by ~2.1 percentage points</w:t>
+      </w:r>
+    </w:p>
+    <w:p>
+      <w:pPr>
+        <w:pStyle w:val="Heading2"/>
+      </w:pPr>
+      <w:r>
+        <w:rPr>
+          <w:color w:val="1A1A2E"/>
+        </w:rPr>
+        <w:t>Edge Case Behaviour</w:t>
+      </w:r>
+    </w:p>
+    <w:p>
+      <w:pPr>
+        <w:pStyle w:val="ListBullet"/>
+      </w:pPr>
+      <w:r>
+        <w:rPr>
+          <w:b/>
+          <w:sz w:val="22"/>
+        </w:rPr>
+        <w:t xml:space="preserve">Zero capital + zero carbon: </w:t>
+      </w:r>
+      <w:r>
+        <w:rPr>
+          <w:sz w:val="22"/>
+        </w:rPr>
+        <w:t>Division by zero is guarded: CAROIC returns 0.0</w:t>
+      </w:r>
+    </w:p>
+    <w:p>
+      <w:pPr>
+        <w:pStyle w:val="ListBullet"/>
+      </w:pPr>
+      <w:r>
+        <w:rPr>
+          <w:b/>
+          <w:sz w:val="22"/>
+        </w:rPr>
+        <w:t xml:space="preserve">Negative EBITDA: </w:t>
+      </w:r>
+      <w:r>
+        <w:rPr>
+          <w:sz w:val="22"/>
+        </w:rPr>
+        <w:t>CAROIC returns negative value with grade "F"</w:t>
+      </w:r>
+    </w:p>
+    <w:p>
+      <w:pPr>
+        <w:pStyle w:val="ListBullet"/>
+      </w:pPr>
+      <w:r>
+        <w:rPr>
+          <w:b/>
+          <w:sz w:val="22"/>
+        </w:rPr>
+        <w:t xml:space="preserve">Zero carbon tonnage: </w:t>
+      </w:r>
+      <w:r>
+        <w:rPr>
+          <w:sz w:val="22"/>
+        </w:rPr>
+        <w:t>Carbon charge = $0, CAROIC = pure ROIC</w:t>
+      </w:r>
+    </w:p>
+    <w:p>
+      <w:pPr>
+        <w:pStyle w:val="ListBullet"/>
+      </w:pPr>
+      <w:r>
+        <w:rPr>
+          <w:b/>
+          <w:sz w:val="22"/>
+        </w:rPr>
+        <w:t xml:space="preserve">Negative treasury: </w:t>
+      </w:r>
+      <w:r>
+        <w:rPr>
+          <w:sz w:val="22"/>
+        </w:rPr>
+        <w:t>Invested capital floored at $0 — carbon charge alone forms the denominator</w:t>
+      </w:r>
+    </w:p>
+    <w:p>
+      <w:pPr>
+        <w:pStyle w:val="Heading2"/>
+      </w:pPr>
+      <w:r>
+        <w:rPr>
+          <w:color w:val="1A1A2E"/>
+        </w:rPr>
+        <w:t>Strategic Implications</w:t>
+      </w:r>
+    </w:p>
+    <w:p>
+      <w:r>
+        <w:rPr>
+          <w:b w:val="0"/>
+          <w:i w:val="0"/>
+          <w:sz w:val="22"/>
+        </w:rPr>
+        <w:t>CAROIC tells you something traditional financial metrics hide: how dependent your returns are on carbon-intensive operations. As you progress through the simulation, watch how your CAROIC changes relative to your regular EBITDA — if EBITDA is rising but CAROIC is falling, it means your growth is increasingly carbon-dependent.</w:t>
+      </w:r>
+    </w:p>
+    <w:p>
+      <w:r>
+        <w:rPr>
+          <w:b/>
+          <w:i w:val="0"/>
+          <w:sz w:val="22"/>
+        </w:rPr>
+        <w:t>Key Strategic Takeaways:</w:t>
+      </w:r>
+    </w:p>
+    <w:p>
+      <w:pPr>
+        <w:pStyle w:val="ListBullet"/>
+      </w:pPr>
+      <w:r>
+        <w:rPr>
+          <w:sz w:val="22"/>
+        </w:rPr>
+        <w:t>Investing in decarbonisation (R3, R5, R7 options) directly improves CAROIC by reducing the carbon penalty</w:t>
+      </w:r>
+    </w:p>
+    <w:p>
+      <w:pPr>
+        <w:pStyle w:val="ListBullet"/>
+      </w:pPr>
+      <w:r>
+        <w:rPr>
+          <w:sz w:val="22"/>
+        </w:rPr>
+        <w:t>Electronics (CI=72) is the biggest CAROIC drag — targeted green investment there yields outsized CAROIC improvement</w:t>
+      </w:r>
+    </w:p>
+    <w:p>
+      <w:pPr>
+        <w:pStyle w:val="ListBullet"/>
+      </w:pPr>
+      <w:r>
+        <w:rPr>
+          <w:sz w:val="22"/>
+        </w:rPr>
+        <w:t>A strong CAROIC grade signals resilience against future carbon regulation (R10 carbon tax)</w:t>
+      </w:r>
+    </w:p>
+    <w:p>
+      <w:pPr>
+        <w:pStyle w:val="ListBullet"/>
+      </w:pPr>
+      <w:r>
+        <w:rPr>
+          <w:sz w:val="22"/>
+        </w:rPr>
+        <w:t>You can find your CAROIC grade in the Financial tab of your KPI Dashboard, updated every round</w:t>
+      </w:r>
+    </w:p>
+    <w:p/>
     <w:sectPr>
       <w:pgSz w:w="11906" w:h="16838"/>
       <w:pgMar w:top="1440" w:right="1417" w:bottom="1440" w:left="1417" w:header="720" w:footer="720" w:gutter="0"/>

</xml_diff>